<commit_message>
Update DOCX with approved orange palette
</commit_message>
<xml_diff>
--- a/docs/TZ-AK-LOEWEN-gGmbH-v5-source-of-truth.docx
+++ b/docs/TZ-AK-LOEWEN-gGmbH-v5-source-of-truth.docx
@@ -2077,6 +2077,11 @@
         <w:t>Фиксация для системы реализации: работать только с AK-LOEWEN gGmbH и только от commit d640c22c5f1d98f81925b5e7668fdb0b65da76c4. Любая ссылка на v2 означает исторический материал, а не рабочую базу.</w:t>
       </w:r>
     </w:p>
+    <w:p>
+      <w:r>
+        <w:t>Цветовая фиксация по актуальному визуальному файлу: основной оранжевый AK Löwen — #E85A22. Для светлой темы используется #C4501E, дополнительный светлый акцент — #FF7A3D. Значение #FE4123 не использовать и не называть обязательным фирменным цветом проекта.</w:t>
+      </w:r>
+    </w:p>
     <w:sectPr>
       <w:pgSz w:w="12240" w:h="15840"/>
       <w:pgMar w:top="936" w:right="1080" w:bottom="936" w:left="1080" w:header="720" w:footer="720" w:gutter="0"/>

</xml_diff>

<commit_message>
Update canonical source-of-truth DOCX
</commit_message>
<xml_diff>
--- a/docs/TZ-AK-LOEWEN-gGmbH-v5-source-of-truth.docx
+++ b/docs/TZ-AK-LOEWEN-gGmbH-v5-source-of-truth.docx
@@ -43,7 +43,7 @@
     </w:p>
     <w:p>
       <w:r>
-        <w:t>Рабочей базой является только уже реализованная версия сайта из pull request #1, commit d640c22c5f1d98f81925b5e7668fdb0b65da76c4 в репозитории koss32/Ak-l-wen. Это версия v1 из каталога site/ и автономный файл concepts/ak-loewen-valset-site-v1.html. Старый concepts/ak-loewen-valset-konzept-v2.html не является исходником для новых правок и не должен восстанавливаться, копироваться или использоваться вместо v1.</w:t>
+        <w:t>Рабочей базой является только уже реализованная версия сайта из pull request #1, commit d640c22c5f1d98f81925b5e7668fdb0b65da76c4 в репозитории koss32/Ak-loewen, ветка codex/site-v1. Это версия v1 из каталога site/ и автономный файл concepts/ak-loewen-valset-site-v1.html. Основная ветка репозитория называется Ak-loewen и содержит документацию; для реализации сайта использовать именно codex/site-v1. Старый concepts/ak-loewen-valset-konzept-v2.html не является исходником для новых правок и не должен восстанавливаться, копироваться или использоваться вместо v1.</w:t>
       </w:r>
     </w:p>
     <w:p>
@@ -229,13 +229,7 @@
             <w:pPr>
               <w:spacing w:after="40"/>
             </w:pPr>
-            <w:r/>
             <w:r>
-              <w:rPr>
-                <w:b/>
-                <w:color w:val="FFFFFF"/>
-                <w:sz w:val="19"/>
-              </w:rPr>
               <w:t>Релиз</w:t>
             </w:r>
           </w:p>
@@ -250,13 +244,7 @@
             <w:pPr>
               <w:spacing w:after="40"/>
             </w:pPr>
-            <w:r/>
             <w:r>
-              <w:rPr>
-                <w:b/>
-                <w:color w:val="FFFFFF"/>
-                <w:sz w:val="19"/>
-              </w:rPr>
               <w:t>Содержание</w:t>
             </w:r>
           </w:p>
@@ -271,13 +259,7 @@
             <w:pPr>
               <w:spacing w:after="40"/>
             </w:pPr>
-            <w:r/>
             <w:r>
-              <w:rPr>
-                <w:b/>
-                <w:color w:val="FFFFFF"/>
-                <w:sz w:val="19"/>
-              </w:rPr>
               <w:t>Результат и условие перехода</w:t>
             </w:r>
           </w:p>
@@ -293,12 +275,7 @@
             <w:pPr>
               <w:spacing w:after="40"/>
             </w:pPr>
-            <w:r/>
             <w:r>
-              <w:rPr>
-                <w:b w:val="0"/>
-                <w:sz w:val="19"/>
-              </w:rPr>
               <w:t>A · функциональный</w:t>
             </w:r>
           </w:p>
@@ -312,12 +289,7 @@
             <w:pPr>
               <w:spacing w:after="40"/>
             </w:pPr>
-            <w:r/>
             <w:r>
-              <w:rPr>
-                <w:b w:val="0"/>
-                <w:sz w:val="19"/>
-              </w:rPr>
               <w:t>Пересборка HTML, структура, тексты, DE/RU/UK/TR, навигация, VALSET, расписание, формы, Telegram, правовые страницы, тренеры, адаптивность, доступность и QA.</w:t>
             </w:r>
           </w:p>
@@ -331,12 +303,7 @@
             <w:pPr>
               <w:spacing w:after="40"/>
             </w:pPr>
-            <w:r/>
             <w:r>
-              <w:rPr>
-                <w:b w:val="0"/>
-                <w:sz w:val="19"/>
-              </w:rPr>
               <w:t>Отдельная рабочая версия и changelog. Переход дальше только после письменного одобрения заказчика.</w:t>
             </w:r>
           </w:p>
@@ -353,12 +320,7 @@
             <w:pPr>
               <w:spacing w:after="40"/>
             </w:pPr>
-            <w:r/>
             <w:r>
-              <w:rPr>
-                <w:b w:val="0"/>
-                <w:sz w:val="19"/>
-              </w:rPr>
               <w:t>B · motion</w:t>
             </w:r>
           </w:p>
@@ -373,12 +335,7 @@
             <w:pPr>
               <w:spacing w:after="40"/>
             </w:pPr>
-            <w:r/>
             <w:r>
-              <w:rPr>
-                <w:b w:val="0"/>
-                <w:sz w:val="19"/>
-              </w:rPr>
               <w:t>Scroll-анимации и микровзаимодействия поверх одобренного релиза A.</w:t>
             </w:r>
           </w:p>
@@ -393,12 +350,7 @@
             <w:pPr>
               <w:spacing w:after="40"/>
             </w:pPr>
-            <w:r/>
             <w:r>
-              <w:rPr>
-                <w:b w:val="0"/>
-                <w:sz w:val="19"/>
-              </w:rPr>
               <w:t>Отдельная ветка/tag; не изменяет смысл и структуру утверждённого релиза A.</w:t>
             </w:r>
           </w:p>
@@ -751,13 +703,7 @@
             <w:pPr>
               <w:spacing w:after="40"/>
             </w:pPr>
-            <w:r/>
             <w:r>
-              <w:rPr>
-                <w:b/>
-                <w:color w:val="FFFFFF"/>
-                <w:sz w:val="19"/>
-              </w:rPr>
               <w:t>Поле</w:t>
             </w:r>
           </w:p>
@@ -772,13 +718,7 @@
             <w:pPr>
               <w:spacing w:after="40"/>
             </w:pPr>
-            <w:r/>
             <w:r>
-              <w:rPr>
-                <w:b/>
-                <w:color w:val="FFFFFF"/>
-                <w:sz w:val="19"/>
-              </w:rPr>
               <w:t>Правило</w:t>
             </w:r>
           </w:p>
@@ -794,12 +734,7 @@
             <w:pPr>
               <w:spacing w:after="40"/>
             </w:pPr>
-            <w:r/>
             <w:r>
-              <w:rPr>
-                <w:b w:val="0"/>
-                <w:sz w:val="19"/>
-              </w:rPr>
               <w:t>Имя</w:t>
             </w:r>
           </w:p>
@@ -813,12 +748,7 @@
             <w:pPr>
               <w:spacing w:after="40"/>
             </w:pPr>
-            <w:r/>
             <w:r>
-              <w:rPr>
-                <w:b w:val="0"/>
-                <w:sz w:val="19"/>
-              </w:rPr>
               <w:t>Обязательно, 2–80 символов.</w:t>
             </w:r>
           </w:p>
@@ -835,12 +765,7 @@
             <w:pPr>
               <w:spacing w:after="40"/>
             </w:pPr>
-            <w:r/>
             <w:r>
-              <w:rPr>
-                <w:b w:val="0"/>
-                <w:sz w:val="19"/>
-              </w:rPr>
               <w:t>Направление</w:t>
             </w:r>
           </w:p>
@@ -855,12 +780,7 @@
             <w:pPr>
               <w:spacing w:after="40"/>
             </w:pPr>
-            <w:r/>
             <w:r>
-              <w:rPr>
-                <w:b w:val="0"/>
-                <w:sz w:val="19"/>
-              </w:rPr>
               <w:t>Только Boxen, Sambo und MMA или VALSET.</w:t>
             </w:r>
           </w:p>
@@ -876,12 +796,7 @@
             <w:pPr>
               <w:spacing w:after="40"/>
             </w:pPr>
-            <w:r/>
             <w:r>
-              <w:rPr>
-                <w:b w:val="0"/>
-                <w:sz w:val="19"/>
-              </w:rPr>
               <w:t>Группа</w:t>
             </w:r>
           </w:p>
@@ -895,12 +810,7 @@
             <w:pPr>
               <w:spacing w:after="40"/>
             </w:pPr>
-            <w:r/>
             <w:r>
-              <w:rPr>
-                <w:b w:val="0"/>
-                <w:sz w:val="19"/>
-              </w:rPr>
               <w:t>Показывается после направления; только подтверждённые значения.</w:t>
             </w:r>
           </w:p>
@@ -917,12 +827,7 @@
             <w:pPr>
               <w:spacing w:after="40"/>
             </w:pPr>
-            <w:r/>
             <w:r>
-              <w:rPr>
-                <w:b w:val="0"/>
-                <w:sz w:val="19"/>
-              </w:rPr>
               <w:t>Возраст</w:t>
             </w:r>
           </w:p>
@@ -937,12 +842,7 @@
             <w:pPr>
               <w:spacing w:after="40"/>
             </w:pPr>
-            <w:r/>
             <w:r>
-              <w:rPr>
-                <w:b w:val="0"/>
-                <w:sz w:val="19"/>
-              </w:rPr>
               <w:t>Для детей обязателен; хранить минимально необходимое значение, не дату рождения.</w:t>
             </w:r>
           </w:p>
@@ -958,12 +858,7 @@
             <w:pPr>
               <w:spacing w:after="40"/>
             </w:pPr>
-            <w:r/>
             <w:r>
-              <w:rPr>
-                <w:b w:val="0"/>
-                <w:sz w:val="19"/>
-              </w:rPr>
               <w:t>Контакт</w:t>
             </w:r>
           </w:p>
@@ -977,12 +872,7 @@
             <w:pPr>
               <w:spacing w:after="40"/>
             </w:pPr>
-            <w:r/>
             <w:r>
-              <w:rPr>
-                <w:b w:val="0"/>
-                <w:sz w:val="19"/>
-              </w:rPr>
               <w:t>Хотя бы телефон, e-mail или Telegram username; валидировать по типу.</w:t>
             </w:r>
           </w:p>
@@ -999,12 +889,7 @@
             <w:pPr>
               <w:spacing w:after="40"/>
             </w:pPr>
-            <w:r/>
             <w:r>
-              <w:rPr>
-                <w:b w:val="0"/>
-                <w:sz w:val="19"/>
-              </w:rPr>
               <w:t>Желаемое время</w:t>
             </w:r>
           </w:p>
@@ -1019,12 +904,7 @@
             <w:pPr>
               <w:spacing w:after="40"/>
             </w:pPr>
-            <w:r/>
             <w:r>
-              <w:rPr>
-                <w:b w:val="0"/>
-                <w:sz w:val="19"/>
-              </w:rPr>
               <w:t>Необязательно; только подтверждённые интервалы или комментарий.</w:t>
             </w:r>
           </w:p>
@@ -1040,12 +920,7 @@
             <w:pPr>
               <w:spacing w:after="40"/>
             </w:pPr>
-            <w:r/>
             <w:r>
-              <w:rPr>
-                <w:b w:val="0"/>
-                <w:sz w:val="19"/>
-              </w:rPr>
               <w:t>Комментарий</w:t>
             </w:r>
           </w:p>
@@ -1059,12 +934,7 @@
             <w:pPr>
               <w:spacing w:after="40"/>
             </w:pPr>
-            <w:r/>
             <w:r>
-              <w:rPr>
-                <w:b w:val="0"/>
-                <w:sz w:val="19"/>
-              </w:rPr>
               <w:t>Необязательно; ограничение длины и серверная очистка.</w:t>
             </w:r>
           </w:p>
@@ -1081,12 +951,7 @@
             <w:pPr>
               <w:spacing w:after="40"/>
             </w:pPr>
-            <w:r/>
             <w:r>
-              <w:rPr>
-                <w:b w:val="0"/>
-                <w:sz w:val="19"/>
-              </w:rPr>
               <w:t>Согласие</w:t>
             </w:r>
           </w:p>
@@ -1101,12 +966,7 @@
             <w:pPr>
               <w:spacing w:after="40"/>
             </w:pPr>
-            <w:r/>
             <w:r>
-              <w:rPr>
-                <w:b w:val="0"/>
-                <w:sz w:val="19"/>
-              </w:rPr>
               <w:t>Отдельная обязательная отметка со ссылкой на Datenschutz, без предварительной отметки.</w:t>
             </w:r>
           </w:p>
@@ -1431,13 +1291,7 @@
             <w:pPr>
               <w:spacing w:after="40"/>
             </w:pPr>
-            <w:r/>
             <w:r>
-              <w:rPr>
-                <w:b/>
-                <w:color w:val="FFFFFF"/>
-                <w:sz w:val="19"/>
-              </w:rPr>
               <w:t>Этап</w:t>
             </w:r>
           </w:p>
@@ -1452,13 +1306,7 @@
             <w:pPr>
               <w:spacing w:after="40"/>
             </w:pPr>
-            <w:r/>
             <w:r>
-              <w:rPr>
-                <w:b/>
-                <w:color w:val="FFFFFF"/>
-                <w:sz w:val="19"/>
-              </w:rPr>
               <w:t>Что делается</w:t>
             </w:r>
           </w:p>
@@ -1473,13 +1321,7 @@
             <w:pPr>
               <w:spacing w:after="40"/>
             </w:pPr>
-            <w:r/>
             <w:r>
-              <w:rPr>
-                <w:b/>
-                <w:color w:val="FFFFFF"/>
-                <w:sz w:val="19"/>
-              </w:rPr>
               <w:t>Что показывается заказчику</w:t>
             </w:r>
           </w:p>
@@ -1495,12 +1337,7 @@
             <w:pPr>
               <w:spacing w:after="40"/>
             </w:pPr>
-            <w:r/>
             <w:r>
-              <w:rPr>
-                <w:b w:val="0"/>
-                <w:sz w:val="19"/>
-              </w:rPr>
               <w:t>1. Аудит</w:t>
             </w:r>
           </w:p>
@@ -1514,12 +1351,7 @@
             <w:pPr>
               <w:spacing w:after="40"/>
             </w:pPr>
-            <w:r/>
             <w:r>
-              <w:rPr>
-                <w:b w:val="0"/>
-                <w:sz w:val="19"/>
-              </w:rPr>
               <w:t>Репозиторий, v2, reference, assets, ТЗ, повреждения и список вопросов.</w:t>
             </w:r>
           </w:p>
@@ -1533,12 +1365,7 @@
             <w:pPr>
               <w:spacing w:after="40"/>
             </w:pPr>
-            <w:r/>
             <w:r>
-              <w:rPr>
-                <w:b w:val="0"/>
-                <w:sz w:val="19"/>
-              </w:rPr>
               <w:t>Карта проблем и подтверждённые/неподтверждённые данные.</w:t>
             </w:r>
           </w:p>
@@ -1555,12 +1382,7 @@
             <w:pPr>
               <w:spacing w:after="40"/>
             </w:pPr>
-            <w:r/>
             <w:r>
-              <w:rPr>
-                <w:b w:val="0"/>
-                <w:sz w:val="19"/>
-              </w:rPr>
               <w:t>2. Чистая пересборка</w:t>
             </w:r>
           </w:p>
@@ -1575,12 +1397,7 @@
             <w:pPr>
               <w:spacing w:after="40"/>
             </w:pPr>
-            <w:r/>
             <w:r>
-              <w:rPr>
-                <w:b w:val="0"/>
-                <w:sz w:val="19"/>
-              </w:rPr>
               <w:t>Новая валидная база без изменения v2.</w:t>
             </w:r>
           </w:p>
@@ -1595,12 +1412,7 @@
             <w:pPr>
               <w:spacing w:after="40"/>
             </w:pPr>
-            <w:r/>
             <w:r>
-              <w:rPr>
-                <w:b w:val="0"/>
-                <w:sz w:val="19"/>
-              </w:rPr>
               <w:t>Рабочий preview базовой версии.</w:t>
             </w:r>
           </w:p>
@@ -1616,12 +1428,7 @@
             <w:pPr>
               <w:spacing w:after="40"/>
             </w:pPr>
-            <w:r/>
             <w:r>
-              <w:rPr>
-                <w:b w:val="0"/>
-                <w:sz w:val="19"/>
-              </w:rPr>
               <w:t>3. Структура и контент</w:t>
             </w:r>
           </w:p>
@@ -1635,12 +1442,7 @@
             <w:pPr>
               <w:spacing w:after="40"/>
             </w:pPr>
-            <w:r/>
             <w:r>
-              <w:rPr>
-                <w:b w:val="0"/>
-                <w:sz w:val="19"/>
-              </w:rPr>
               <w:t>Секции, языки, VALSET, тренеры, расписание, юридические ссылки.</w:t>
             </w:r>
           </w:p>
@@ -1654,12 +1456,7 @@
             <w:pPr>
               <w:spacing w:after="40"/>
             </w:pPr>
-            <w:r/>
             <w:r>
-              <w:rPr>
-                <w:b w:val="0"/>
-                <w:sz w:val="19"/>
-              </w:rPr>
               <w:t>Полный статический preview и список вопросов.</w:t>
             </w:r>
           </w:p>
@@ -1676,12 +1473,7 @@
             <w:pPr>
               <w:spacing w:after="40"/>
             </w:pPr>
-            <w:r/>
             <w:r>
-              <w:rPr>
-                <w:b w:val="0"/>
-                <w:sz w:val="19"/>
-              </w:rPr>
               <w:t>4. Функции</w:t>
             </w:r>
           </w:p>
@@ -1696,12 +1488,7 @@
             <w:pPr>
               <w:spacing w:after="40"/>
             </w:pPr>
-            <w:r/>
             <w:r>
-              <w:rPr>
-                <w:b w:val="0"/>
-                <w:sz w:val="19"/>
-              </w:rPr>
               <w:t>Навигация, формы, Telegram, фильтры, состояния, доступность.</w:t>
             </w:r>
           </w:p>
@@ -1716,12 +1503,7 @@
             <w:pPr>
               <w:spacing w:after="40"/>
             </w:pPr>
-            <w:r/>
             <w:r>
-              <w:rPr>
-                <w:b w:val="0"/>
-                <w:sz w:val="19"/>
-              </w:rPr>
               <w:t>Интерактивный preview и сценарии тестирования.</w:t>
             </w:r>
           </w:p>
@@ -1737,12 +1519,7 @@
             <w:pPr>
               <w:spacing w:after="40"/>
             </w:pPr>
-            <w:r/>
             <w:r>
-              <w:rPr>
-                <w:b w:val="0"/>
-                <w:sz w:val="19"/>
-              </w:rPr>
               <w:t>5. QA релиза A</w:t>
             </w:r>
           </w:p>
@@ -1756,12 +1533,7 @@
             <w:pPr>
               <w:spacing w:after="40"/>
             </w:pPr>
-            <w:r/>
             <w:r>
-              <w:rPr>
-                <w:b w:val="0"/>
-                <w:sz w:val="19"/>
-              </w:rPr>
               <w:t>Адаптивность, браузеры, клавиатура, консоль, языки, формы, безопасность.</w:t>
             </w:r>
           </w:p>
@@ -1775,12 +1547,7 @@
             <w:pPr>
               <w:spacing w:after="40"/>
             </w:pPr>
-            <w:r/>
             <w:r>
-              <w:rPr>
-                <w:b w:val="0"/>
-                <w:sz w:val="19"/>
-              </w:rPr>
               <w:t>Changelog, чек-лист и отдельная копия для одобрения.</w:t>
             </w:r>
           </w:p>
@@ -1797,12 +1564,7 @@
             <w:pPr>
               <w:spacing w:after="40"/>
             </w:pPr>
-            <w:r/>
             <w:r>
-              <w:rPr>
-                <w:b w:val="0"/>
-                <w:sz w:val="19"/>
-              </w:rPr>
               <w:t>6. Релиз B</w:t>
             </w:r>
           </w:p>
@@ -1817,12 +1579,7 @@
             <w:pPr>
               <w:spacing w:after="40"/>
             </w:pPr>
-            <w:r/>
             <w:r>
-              <w:rPr>
-                <w:b w:val="0"/>
-                <w:sz w:val="19"/>
-              </w:rPr>
               <w:t>Анимации после одобрения A.</w:t>
             </w:r>
           </w:p>
@@ -1837,12 +1594,7 @@
             <w:pPr>
               <w:spacing w:after="40"/>
             </w:pPr>
-            <w:r/>
             <w:r>
-              <w:rPr>
-                <w:b w:val="0"/>
-                <w:sz w:val="19"/>
-              </w:rPr>
               <w:t>Отдельный preview, сравнение с A и performance-метрики.</w:t>
             </w:r>
           </w:p>

</xml_diff>